<commit_message>
fix(task): tratar entidade XML inválida e separadores do DOCX
Move a conversão do document.xml para dentro do try do extrator: uma entidade
numérica fora da faixa Unicode virava RangeError cru em vez de 400 acionável.
Tabulações e quebras de linha do Word passam a separar palavras no texto
enviado ao provedor. Exporta DOCX_MIME_TYPE para rota, OpenAPI e testes,
atualiza o README do task-service e cobre o fluxo HTTP completo com o adapter
de IA falso.

Co-Authored-By: Claude Opus 5 (1M context) <noreply@anthropic.com>
Claude-Session: https://claude.ai/code/session_01KEHWKjRqMkZFavEjJoW6AK
</commit_message>
<xml_diff>
--- a/services/task-service/src/test/fixtures/meeting-minutes.docx
+++ b/services/task-service/src/test/fixtures/meeting-minutes.docx
@@ -10,6 +10,23 @@
     <w:p>
       <w:r>
         <w:t>- Reunir documentos do cliente</w:t>
+      </w:r>
+    </w:p>
+    <w:p>
+      <w:r>
+        <w:t>Responsável:</w:t>
+      </w:r>
+      <w:r>
+        <w:tab/>
+      </w:r>
+      <w:r>
+        <w:t>João</w:t>
+      </w:r>
+      <w:r>
+        <w:br/>
+      </w:r>
+      <w:r>
+        <w:t>Prazo: 30/09</w:t>
       </w:r>
     </w:p>
     <w:p>

</xml_diff>